<commit_message>
Nieuw eCRF-document 45a: 2-wekelijks gezondheidseconomisch dagboek (maand 0-3), conform de afspraak (grondige baseline, 2-wekelijks tot 3 maanden, 3-maandelijks van 3 tot 18 maanden). Bevat 6 periodes (week 1-2 t.e.m. 11-13) met de niet-medicatiegerelateerde delen van het dagboek (kinesist/ergo, consultaties, thuisverpleegkundige, thuiszorg, voetzorgmateriaal, ziekenhuisverblijf); medicatie blijft wekelijks bijgehouden in doc 45 zelf. Geplaatst bij Visite 1 (Gezondheidseconomie), samen met doc 45 waarvan de inleiding er nu naar verwijst. Protocol bijgewerkt op alle 4 plekken waar 45/45b vermeld worden, en protocol-analyse.html aangevuld.
</commit_message>
<xml_diff>
--- a/(e)CRF/Per nummer/45_Gezondheidseconomisch dagboek.docx
+++ b/(e)CRF/Per nummer/45_Gezondheidseconomisch dagboek.docx
@@ -6192,6 +6192,16 @@
     <w:p>
       <w:r>
         <w:br w:type="page"/>
+      </w:r>
+    </w:p>
+    <w:p>
+      <w:pPr/>
+      <w:r>
+        <w:rPr>
+          <w:i/>
+          <w:color w:val="00407A"/>
+        </w:rPr>
+        <w:t>Belangrijk: de onderdelen hieronder (Deel 2 t.e.m. Deel 7) vraagt u enkel in te vullen voor WEEK 1 van dit dagboek, als onderdeel van uw volledig overzicht bij de start van de studie. Vanaf week 2 tot en met week 13 gebruikt u hiervoor de aparte 2-wekelijkse dagboekjes (eCRF-document 45a: Gezondheidseconomisch dagboek, 2-wekelijks, maand 0–3), die u samen met dit dagboek meekreeg.</w:t>
       </w:r>
     </w:p>
     <w:p>

</xml_diff>